<commit_message>
made some changes to the layout
</commit_message>
<xml_diff>
--- a/Data Preparation/poc_train_test_strategy_updated.docx
+++ b/Data Preparation/poc_train_test_strategy_updated.docx
@@ -1563,7 +1563,6 @@
     <w:p>
       <w:pPr>
         <w:pStyle w:val="Heading2"/>
-        <w:spacing w:before="200" w:after="120"/>
       </w:pPr>
       <w:r>
         <w:t>6. Data Availability by Grouping of Months</w:t>
@@ -1601,9 +1600,9 @@
         <w:tblLook w:val="0000" w:firstRow="0" w:lastRow="0" w:firstColumn="0" w:lastColumn="0" w:noHBand="0" w:noVBand="0"/>
       </w:tblPr>
       <w:tblGrid>
-        <w:gridCol w:w="3360"/>
-        <w:gridCol w:w="3360"/>
-        <w:gridCol w:w="3360"/>
+        <w:gridCol w:w="2711"/>
+        <w:gridCol w:w="5779"/>
+        <w:gridCol w:w="1590"/>
       </w:tblGrid>
       <w:tr>
         <w:trPr>
@@ -1611,7 +1610,7 @@
         </w:trPr>
         <w:tc>
           <w:tcPr>
-            <w:tcW w:w="3360" w:type="dxa"/>
+            <w:tcW w:w="2711" w:type="dxa"/>
             <w:shd w:val="clear" w:color="auto" w:fill="1F3864"/>
             <w:tcMar>
               <w:top w:w="100" w:type="dxa"/>
@@ -1633,13 +1632,23 @@
                 <w:sz w:val="20"/>
                 <w:szCs w:val="20"/>
               </w:rPr>
-              <w:t>Months of Data Available</w:t>
-            </w:r>
-          </w:p>
-        </w:tc>
-        <w:tc>
-          <w:tcPr>
-            <w:tcW w:w="3360" w:type="dxa"/>
+              <w:t>Months of Dat</w:t>
+            </w:r>
+            <w:r>
+              <w:rPr>
+                <w:b/>
+                <w:bCs/>
+                <w:color w:val="FFFFFF"/>
+                <w:sz w:val="20"/>
+                <w:szCs w:val="20"/>
+              </w:rPr>
+              <w:t>a Available</w:t>
+            </w:r>
+          </w:p>
+        </w:tc>
+        <w:tc>
+          <w:tcPr>
+            <w:tcW w:w="5779" w:type="dxa"/>
             <w:shd w:val="clear" w:color="auto" w:fill="1F3864"/>
             <w:tcMar>
               <w:top w:w="100" w:type="dxa"/>
@@ -1667,7 +1676,7 @@
         </w:tc>
         <w:tc>
           <w:tcPr>
-            <w:tcW w:w="3360" w:type="dxa"/>
+            <w:tcW w:w="1590" w:type="dxa"/>
             <w:shd w:val="clear" w:color="auto" w:fill="1F3864"/>
             <w:tcMar>
               <w:top w:w="100" w:type="dxa"/>
@@ -1697,7 +1706,7 @@
       <w:tr>
         <w:tc>
           <w:tcPr>
-            <w:tcW w:w="3360" w:type="dxa"/>
+            <w:tcW w:w="2711" w:type="dxa"/>
             <w:shd w:val="clear" w:color="auto" w:fill="D9EAD3"/>
             <w:tcMar>
               <w:top w:w="80" w:type="dxa"/>
@@ -1722,7 +1731,7 @@
         </w:tc>
         <w:tc>
           <w:tcPr>
-            <w:tcW w:w="3360" w:type="dxa"/>
+            <w:tcW w:w="5779" w:type="dxa"/>
             <w:shd w:val="clear" w:color="auto" w:fill="D9EAD3"/>
             <w:tcMar>
               <w:top w:w="80" w:type="dxa"/>
@@ -1750,7 +1759,7 @@
         </w:tc>
         <w:tc>
           <w:tcPr>
-            <w:tcW w:w="3360" w:type="dxa"/>
+            <w:tcW w:w="1590" w:type="dxa"/>
             <w:shd w:val="clear" w:color="auto" w:fill="D9EAD3"/>
             <w:tcMar>
               <w:top w:w="80" w:type="dxa"/>
@@ -1772,7 +1781,17 @@
                 <w:sz w:val="20"/>
                 <w:szCs w:val="20"/>
               </w:rPr>
-              <w:t>✓ Yes</w:t>
+              <w:t>✓</w:t>
+            </w:r>
+            <w:r>
+              <w:rPr>
+                <w:b/>
+                <w:bCs/>
+                <w:color w:val="1E5C1E"/>
+                <w:sz w:val="20"/>
+                <w:szCs w:val="20"/>
+              </w:rPr>
+              <w:t xml:space="preserve"> Yes</w:t>
             </w:r>
           </w:p>
         </w:tc>
@@ -1780,7 +1799,7 @@
       <w:tr>
         <w:tc>
           <w:tcPr>
-            <w:tcW w:w="3360" w:type="dxa"/>
+            <w:tcW w:w="2711" w:type="dxa"/>
             <w:shd w:val="clear" w:color="auto" w:fill="F2F2F2"/>
             <w:tcMar>
               <w:top w:w="80" w:type="dxa"/>
@@ -1803,7 +1822,7 @@
         </w:tc>
         <w:tc>
           <w:tcPr>
-            <w:tcW w:w="3360" w:type="dxa"/>
+            <w:tcW w:w="5779" w:type="dxa"/>
             <w:shd w:val="clear" w:color="auto" w:fill="F2F2F2"/>
             <w:tcMar>
               <w:top w:w="80" w:type="dxa"/>
@@ -1829,7 +1848,7 @@
         </w:tc>
         <w:tc>
           <w:tcPr>
-            <w:tcW w:w="3360" w:type="dxa"/>
+            <w:tcW w:w="1590" w:type="dxa"/>
             <w:shd w:val="clear" w:color="auto" w:fill="F2F2F2"/>
             <w:tcMar>
               <w:top w:w="80" w:type="dxa"/>
@@ -1849,7 +1868,15 @@
                 <w:sz w:val="20"/>
                 <w:szCs w:val="20"/>
               </w:rPr>
-              <w:t>✗ Excluded</w:t>
+              <w:t>✗</w:t>
+            </w:r>
+            <w:r>
+              <w:rPr>
+                <w:color w:val="888888"/>
+                <w:sz w:val="20"/>
+                <w:szCs w:val="20"/>
+              </w:rPr>
+              <w:t xml:space="preserve"> Excluded</w:t>
             </w:r>
           </w:p>
         </w:tc>
@@ -1857,7 +1884,7 @@
       <w:tr>
         <w:tc>
           <w:tcPr>
-            <w:tcW w:w="3360" w:type="dxa"/>
+            <w:tcW w:w="2711" w:type="dxa"/>
             <w:shd w:val="clear" w:color="auto" w:fill="FFFFFF"/>
             <w:tcMar>
               <w:top w:w="80" w:type="dxa"/>
@@ -1880,7 +1907,7 @@
         </w:tc>
         <w:tc>
           <w:tcPr>
-            <w:tcW w:w="3360" w:type="dxa"/>
+            <w:tcW w:w="5779" w:type="dxa"/>
             <w:shd w:val="clear" w:color="auto" w:fill="FFFFFF"/>
             <w:tcMar>
               <w:top w:w="80" w:type="dxa"/>
@@ -1906,7 +1933,7 @@
         </w:tc>
         <w:tc>
           <w:tcPr>
-            <w:tcW w:w="3360" w:type="dxa"/>
+            <w:tcW w:w="1590" w:type="dxa"/>
             <w:shd w:val="clear" w:color="auto" w:fill="FFFFFF"/>
             <w:tcMar>
               <w:top w:w="80" w:type="dxa"/>
@@ -1926,7 +1953,15 @@
                 <w:sz w:val="20"/>
                 <w:szCs w:val="20"/>
               </w:rPr>
-              <w:t>✗ Excluded</w:t>
+              <w:t>✗</w:t>
+            </w:r>
+            <w:r>
+              <w:rPr>
+                <w:color w:val="888888"/>
+                <w:sz w:val="20"/>
+                <w:szCs w:val="20"/>
+              </w:rPr>
+              <w:t xml:space="preserve"> Excluded</w:t>
             </w:r>
           </w:p>
         </w:tc>
@@ -1934,7 +1969,7 @@
       <w:tr>
         <w:tc>
           <w:tcPr>
-            <w:tcW w:w="3360" w:type="dxa"/>
+            <w:tcW w:w="2711" w:type="dxa"/>
             <w:shd w:val="clear" w:color="auto" w:fill="F2F2F2"/>
             <w:tcMar>
               <w:top w:w="80" w:type="dxa"/>
@@ -1957,7 +1992,7 @@
         </w:tc>
         <w:tc>
           <w:tcPr>
-            <w:tcW w:w="3360" w:type="dxa"/>
+            <w:tcW w:w="5779" w:type="dxa"/>
             <w:shd w:val="clear" w:color="auto" w:fill="F2F2F2"/>
             <w:tcMar>
               <w:top w:w="80" w:type="dxa"/>
@@ -1983,7 +2018,7 @@
         </w:tc>
         <w:tc>
           <w:tcPr>
-            <w:tcW w:w="3360" w:type="dxa"/>
+            <w:tcW w:w="1590" w:type="dxa"/>
             <w:shd w:val="clear" w:color="auto" w:fill="F2F2F2"/>
             <w:tcMar>
               <w:top w:w="80" w:type="dxa"/>
@@ -2003,7 +2038,15 @@
                 <w:sz w:val="20"/>
                 <w:szCs w:val="20"/>
               </w:rPr>
-              <w:t>✗ Excluded</w:t>
+              <w:t>✗</w:t>
+            </w:r>
+            <w:r>
+              <w:rPr>
+                <w:color w:val="888888"/>
+                <w:sz w:val="20"/>
+                <w:szCs w:val="20"/>
+              </w:rPr>
+              <w:t xml:space="preserve"> Excluded</w:t>
             </w:r>
           </w:p>
         </w:tc>
@@ -2011,7 +2054,7 @@
       <w:tr>
         <w:tc>
           <w:tcPr>
-            <w:tcW w:w="3360" w:type="dxa"/>
+            <w:tcW w:w="2711" w:type="dxa"/>
             <w:shd w:val="clear" w:color="auto" w:fill="1F3864"/>
             <w:tcMar>
               <w:top w:w="100" w:type="dxa"/>
@@ -2036,7 +2079,7 @@
         </w:tc>
         <w:tc>
           <w:tcPr>
-            <w:tcW w:w="3360" w:type="dxa"/>
+            <w:tcW w:w="5779" w:type="dxa"/>
             <w:shd w:val="clear" w:color="auto" w:fill="1F3864"/>
             <w:tcMar>
               <w:top w:w="100" w:type="dxa"/>
@@ -2064,7 +2107,7 @@
         </w:tc>
         <w:tc>
           <w:tcPr>
-            <w:tcW w:w="3360" w:type="dxa"/>
+            <w:tcW w:w="1590" w:type="dxa"/>
             <w:shd w:val="clear" w:color="auto" w:fill="1F3864"/>
             <w:tcMar>
               <w:top w:w="100" w:type="dxa"/>
@@ -2087,335 +2130,6 @@
                 <w:szCs w:val="20"/>
               </w:rPr>
               <w:t>74,383 (68.3%)</w:t>
-            </w:r>
-          </w:p>
-        </w:tc>
-      </w:tr>
-      <w:tr>
-        <w:trPr>
-          <w:trHeight w:val="300"/>
-        </w:trPr>
-        <w:tc>
-          <w:tcPr>
-            <w:tcW w:w="2440" w:type="dxa"/>
-            <w:tcBorders>
-              <w:top w:val="single" w:sz="8" w:space="0" w:color="auto"/>
-              <w:left w:val="single" w:sz="8" w:space="0" w:color="auto"/>
-              <w:bottom w:val="single" w:sz="8" w:space="0" w:color="auto"/>
-              <w:right w:val="single" w:sz="8" w:space="0" w:color="auto"/>
-            </w:tcBorders>
-            <w:shd w:val="clear" w:color="000000" w:fill="5B9BD5"/>
-            <w:noWrap/>
-            <w:vAlign w:val="center"/>
-            <w:hideMark/>
-          </w:tcPr>
-          <w:p>
-            <w:pPr>
-              <w:rPr>
-                <w:rFonts w:ascii="Calibri" w:eastAsia="Times New Roman" w:hAnsi="Calibri" w:cs="Times New Roman"/>
-                <w:b/>
-                <w:bCs/>
-                <w:color w:val="FFFFFF"/>
-              </w:rPr>
-            </w:pPr>
-            <w:r>
-              <w:rPr>
-                <w:rFonts w:ascii="Calibri" w:eastAsia="Times New Roman" w:hAnsi="Calibri" w:cs="Times New Roman"/>
-                <w:b/>
-                <w:bCs/>
-                <w:color w:val="FFFFFF"/>
-              </w:rPr>
-              <w:t>GROUPING_OF_MONTHS</w:t>
-            </w:r>
-          </w:p>
-        </w:tc>
-        <w:tc>
-          <w:tcPr>
-            <w:tcW w:w="5740" w:type="dxa"/>
-            <w:tcBorders>
-              <w:top w:val="single" w:sz="8" w:space="0" w:color="auto"/>
-              <w:left w:val="nil"/>
-              <w:bottom w:val="single" w:sz="8" w:space="0" w:color="auto"/>
-              <w:right w:val="single" w:sz="8" w:space="0" w:color="auto"/>
-            </w:tcBorders>
-            <w:shd w:val="clear" w:color="000000" w:fill="5B9BD5"/>
-            <w:noWrap/>
-            <w:vAlign w:val="center"/>
-            <w:hideMark/>
-          </w:tcPr>
-          <w:p>
-            <w:pPr>
-              <w:rPr>
-                <w:rFonts w:ascii="Calibri" w:eastAsia="Times New Roman" w:hAnsi="Calibri" w:cs="Times New Roman"/>
-                <w:b/>
-                <w:bCs/>
-                <w:color w:val="FFFFFF"/>
-              </w:rPr>
-            </w:pPr>
-            <w:r>
-              <w:rPr>
-                <w:rFonts w:ascii="Calibri" w:eastAsia="Times New Roman" w:hAnsi="Calibri" w:cs="Times New Roman"/>
-                <w:b/>
-                <w:bCs/>
-                <w:color w:val="FFFFFF"/>
-              </w:rPr>
-              <w:t>UNIQUE_PARENT_DEALER_CODE_MODEL_FAMILY_COMBOS</w:t>
-            </w:r>
-          </w:p>
-        </w:tc>
-      </w:tr>
-      <w:tr>
-        <w:trPr>
-          <w:trHeight w:val="300"/>
-        </w:trPr>
-        <w:tc>
-          <w:tcPr>
-            <w:tcW w:w="2440" w:type="dxa"/>
-            <w:tcBorders>
-              <w:top w:val="nil"/>
-              <w:left w:val="single" w:sz="8" w:space="0" w:color="auto"/>
-              <w:bottom w:val="single" w:sz="8" w:space="0" w:color="auto"/>
-              <w:right w:val="single" w:sz="8" w:space="0" w:color="auto"/>
-            </w:tcBorders>
-            <w:shd w:val="clear" w:color="auto" w:fill="auto"/>
-            <w:vAlign w:val="center"/>
-            <w:hideMark/>
-          </w:tcPr>
-          <w:p>
-            <w:pPr>
-              <w:rPr>
-                <w:rFonts w:ascii="Calibri" w:eastAsia="Times New Roman" w:hAnsi="Calibri" w:cs="Times New Roman"/>
-                <w:color w:val="000000"/>
-              </w:rPr>
-            </w:pPr>
-            <w:r>
-              <w:rPr>
-                <w:rFonts w:ascii="Calibri" w:eastAsia="Times New Roman" w:hAnsi="Calibri" w:cs="Times New Roman"/>
-                <w:color w:val="000000"/>
-              </w:rPr>
-              <w:t>&lt;12</w:t>
-            </w:r>
-          </w:p>
-        </w:tc>
-        <w:tc>
-          <w:tcPr>
-            <w:tcW w:w="5740" w:type="dxa"/>
-            <w:tcBorders>
-              <w:top w:val="nil"/>
-              <w:left w:val="nil"/>
-              <w:bottom w:val="single" w:sz="8" w:space="0" w:color="auto"/>
-              <w:right w:val="single" w:sz="8" w:space="0" w:color="auto"/>
-            </w:tcBorders>
-            <w:shd w:val="clear" w:color="auto" w:fill="auto"/>
-            <w:vAlign w:val="center"/>
-            <w:hideMark/>
-          </w:tcPr>
-          <w:p>
-            <w:pPr>
-              <w:jc w:val="right"/>
-              <w:rPr>
-                <w:rFonts w:ascii="Calibri" w:eastAsia="Times New Roman" w:hAnsi="Calibri" w:cs="Times New Roman"/>
-                <w:color w:val="000000"/>
-              </w:rPr>
-            </w:pPr>
-            <w:r>
-              <w:rPr>
-                <w:rFonts w:ascii="Calibri" w:eastAsia="Times New Roman" w:hAnsi="Calibri" w:cs="Times New Roman"/>
-                <w:color w:val="000000"/>
-              </w:rPr>
-              <w:t>15699</w:t>
-            </w:r>
-          </w:p>
-        </w:tc>
-      </w:tr>
-      <w:tr>
-        <w:trPr>
-          <w:trHeight w:val="300"/>
-        </w:trPr>
-        <w:tc>
-          <w:tcPr>
-            <w:tcW w:w="2440" w:type="dxa"/>
-            <w:tcBorders>
-              <w:top w:val="nil"/>
-              <w:left w:val="single" w:sz="8" w:space="0" w:color="auto"/>
-              <w:bottom w:val="single" w:sz="8" w:space="0" w:color="auto"/>
-              <w:right w:val="single" w:sz="8" w:space="0" w:color="auto"/>
-            </w:tcBorders>
-            <w:shd w:val="clear" w:color="auto" w:fill="auto"/>
-            <w:vAlign w:val="center"/>
-            <w:hideMark/>
-          </w:tcPr>
-          <w:p>
-            <w:pPr>
-              <w:rPr>
-                <w:rFonts w:ascii="Calibri" w:eastAsia="Times New Roman" w:hAnsi="Calibri" w:cs="Times New Roman"/>
-                <w:color w:val="000000"/>
-              </w:rPr>
-            </w:pPr>
-            <w:r>
-              <w:rPr>
-                <w:rFonts w:ascii="Calibri" w:eastAsia="Times New Roman" w:hAnsi="Calibri" w:cs="Times New Roman"/>
-                <w:color w:val="000000"/>
-              </w:rPr>
-              <w:t>&gt;=24</w:t>
-            </w:r>
-          </w:p>
-        </w:tc>
-        <w:tc>
-          <w:tcPr>
-            <w:tcW w:w="5740" w:type="dxa"/>
-            <w:tcBorders>
-              <w:top w:val="nil"/>
-              <w:left w:val="nil"/>
-              <w:bottom w:val="single" w:sz="8" w:space="0" w:color="auto"/>
-              <w:right w:val="single" w:sz="8" w:space="0" w:color="auto"/>
-            </w:tcBorders>
-            <w:shd w:val="clear" w:color="auto" w:fill="auto"/>
-            <w:vAlign w:val="center"/>
-            <w:hideMark/>
-          </w:tcPr>
-          <w:p>
-            <w:pPr>
-              <w:jc w:val="right"/>
-              <w:rPr>
-                <w:rFonts w:ascii="Calibri" w:eastAsia="Times New Roman" w:hAnsi="Calibri" w:cs="Times New Roman"/>
-                <w:color w:val="000000"/>
-              </w:rPr>
-            </w:pPr>
-            <w:r>
-              <w:rPr>
-                <w:rFonts w:ascii="Calibri" w:eastAsia="Times New Roman" w:hAnsi="Calibri" w:cs="Times New Roman"/>
-                <w:color w:val="000000"/>
-              </w:rPr>
-              <w:t>74383</w:t>
-            </w:r>
-          </w:p>
-        </w:tc>
-      </w:tr>
-      <w:tr>
-        <w:trPr>
-          <w:trHeight w:val="300"/>
-        </w:trPr>
-        <w:tc>
-          <w:tcPr>
-            <w:tcW w:w="2440" w:type="dxa"/>
-            <w:tcBorders>
-              <w:top w:val="nil"/>
-              <w:left w:val="single" w:sz="8" w:space="0" w:color="auto"/>
-              <w:bottom w:val="single" w:sz="8" w:space="0" w:color="auto"/>
-              <w:right w:val="single" w:sz="8" w:space="0" w:color="auto"/>
-            </w:tcBorders>
-            <w:shd w:val="clear" w:color="auto" w:fill="auto"/>
-            <w:vAlign w:val="center"/>
-            <w:hideMark/>
-          </w:tcPr>
-          <w:p>
-            <w:pPr>
-              <w:rPr>
-                <w:rFonts w:ascii="Calibri" w:eastAsia="Times New Roman" w:hAnsi="Calibri" w:cs="Times New Roman"/>
-                <w:color w:val="000000"/>
-              </w:rPr>
-            </w:pPr>
-            <w:r>
-              <w:rPr>
-                <w:rFonts w:ascii="Calibri" w:eastAsia="Times New Roman" w:hAnsi="Calibri" w:cs="Times New Roman"/>
-                <w:color w:val="000000"/>
-              </w:rPr>
-              <w:t>18 to 23</w:t>
-            </w:r>
-          </w:p>
-        </w:tc>
-        <w:tc>
-          <w:tcPr>
-            <w:tcW w:w="5740" w:type="dxa"/>
-            <w:tcBorders>
-              <w:top w:val="nil"/>
-              <w:left w:val="nil"/>
-              <w:bottom w:val="single" w:sz="8" w:space="0" w:color="auto"/>
-              <w:right w:val="single" w:sz="8" w:space="0" w:color="auto"/>
-            </w:tcBorders>
-            <w:shd w:val="clear" w:color="auto" w:fill="auto"/>
-            <w:vAlign w:val="center"/>
-            <w:hideMark/>
-          </w:tcPr>
-          <w:p>
-            <w:pPr>
-              <w:jc w:val="right"/>
-              <w:rPr>
-                <w:rFonts w:ascii="Calibri" w:eastAsia="Times New Roman" w:hAnsi="Calibri" w:cs="Times New Roman"/>
-                <w:color w:val="000000"/>
-              </w:rPr>
-            </w:pPr>
-            <w:r>
-              <w:rPr>
-                <w:rFonts w:ascii="Calibri" w:eastAsia="Times New Roman" w:hAnsi="Calibri" w:cs="Times New Roman"/>
-                <w:color w:val="000000"/>
-              </w:rPr>
-              <w:t>9505</w:t>
-            </w:r>
-          </w:p>
-        </w:tc>
-      </w:tr>
-      <w:tr>
-        <w:trPr>
-          <w:trHeight w:val="300"/>
-        </w:trPr>
-        <w:tc>
-          <w:tcPr>
-            <w:tcW w:w="2440" w:type="dxa"/>
-            <w:tcBorders>
-              <w:top w:val="nil"/>
-              <w:left w:val="single" w:sz="8" w:space="0" w:color="auto"/>
-              <w:bottom w:val="single" w:sz="8" w:space="0" w:color="auto"/>
-              <w:right w:val="single" w:sz="8" w:space="0" w:color="auto"/>
-            </w:tcBorders>
-            <w:shd w:val="clear" w:color="auto" w:fill="auto"/>
-            <w:vAlign w:val="center"/>
-            <w:hideMark/>
-          </w:tcPr>
-          <w:p>
-            <w:pPr>
-              <w:rPr>
-                <w:rFonts w:ascii="Calibri" w:eastAsia="Times New Roman" w:hAnsi="Calibri" w:cs="Times New Roman"/>
-                <w:color w:val="000000"/>
-              </w:rPr>
-            </w:pPr>
-            <w:r>
-              <w:rPr>
-                <w:rFonts w:ascii="Calibri" w:eastAsia="Times New Roman" w:hAnsi="Calibri" w:cs="Times New Roman"/>
-                <w:color w:val="000000"/>
-              </w:rPr>
-              <w:t>12 to 17</w:t>
-            </w:r>
-          </w:p>
-        </w:tc>
-        <w:tc>
-          <w:tcPr>
-            <w:tcW w:w="5740" w:type="dxa"/>
-            <w:tcBorders>
-              <w:top w:val="nil"/>
-              <w:left w:val="nil"/>
-              <w:bottom w:val="single" w:sz="8" w:space="0" w:color="auto"/>
-              <w:right w:val="single" w:sz="8" w:space="0" w:color="auto"/>
-            </w:tcBorders>
-            <w:shd w:val="clear" w:color="auto" w:fill="auto"/>
-            <w:vAlign w:val="center"/>
-            <w:hideMark/>
-          </w:tcPr>
-          <w:p>
-            <w:pPr>
-              <w:jc w:val="right"/>
-              <w:rPr>
-                <w:rFonts w:ascii="Calibri" w:eastAsia="Times New Roman" w:hAnsi="Calibri" w:cs="Times New Roman"/>
-                <w:color w:val="000000"/>
-              </w:rPr>
-            </w:pPr>
-            <w:r>
-              <w:rPr>
-                <w:rFonts w:ascii="Calibri" w:eastAsia="Times New Roman" w:hAnsi="Calibri" w:cs="Times New Roman"/>
-                <w:color w:val="000000"/>
-              </w:rPr>
-              <w:t>9261</w:t>
             </w:r>
           </w:p>
         </w:tc>
@@ -2425,17 +2139,8 @@
       <w:pPr>
         <w:spacing w:after="240"/>
       </w:pPr>
-      <w:r>
-        <w:tab/>
-        <w:tab/>
-      </w:r>
       <w:bookmarkStart w:id="0" w:name="_GoBack"/>
       <w:bookmarkEnd w:id="0"/>
-    </w:p>
-    <w:p>
-      <w:pPr>
-        <w:spacing w:after="240"/>
-      </w:pPr>
     </w:p>
     <w:p>
       <w:pPr>
@@ -2464,11 +2169,57 @@
           <w:sz w:val="20"/>
           <w:szCs w:val="20"/>
         </w:rPr>
+        <w:lastRenderedPageBreak/>
         <w:t>Note: TFT has access to static dealer and product attributes that Snowflake ML Forecast does not natively support. Any performance improvement from TFT therefore reflects both the architectural advantage of TFT and the additional covariate information it can consume.</w:t>
+      </w:r>
+      <w:r>
+        <w:rPr>
+          <w:i/>
+          <w:iCs/>
+          <w:color w:val="555555"/>
+          <w:sz w:val="20"/>
+          <w:szCs w:val="20"/>
+        </w:rPr>
         <w:tab/>
+      </w:r>
+      <w:r>
+        <w:rPr>
+          <w:i/>
+          <w:iCs/>
+          <w:color w:val="555555"/>
+          <w:sz w:val="20"/>
+          <w:szCs w:val="20"/>
+        </w:rPr>
         <w:tab/>
+      </w:r>
+      <w:r>
+        <w:rPr>
+          <w:i/>
+          <w:iCs/>
+          <w:color w:val="555555"/>
+          <w:sz w:val="20"/>
+          <w:szCs w:val="20"/>
+        </w:rPr>
         <w:tab/>
+      </w:r>
+      <w:r>
+        <w:rPr>
+          <w:i/>
+          <w:iCs/>
+          <w:color w:val="555555"/>
+          <w:sz w:val="20"/>
+          <w:szCs w:val="20"/>
+        </w:rPr>
         <w:tab/>
+      </w:r>
+      <w:r>
+        <w:rPr>
+          <w:i/>
+          <w:iCs/>
+          <w:color w:val="555555"/>
+          <w:sz w:val="20"/>
+          <w:szCs w:val="20"/>
+        </w:rPr>
         <w:tab/>
       </w:r>
     </w:p>
@@ -3540,7 +3291,7 @@
 </file>
 
 <file path=customXml/itemProps1.xml><?xml version="1.0" encoding="utf-8"?>
-<ds:datastoreItem xmlns:ds="http://schemas.openxmlformats.org/officeDocument/2006/customXml" ds:itemID="{7AAD701F-AAC9-4B60-B8F6-9FDB7DE20F40}">
+<ds:datastoreItem xmlns:ds="http://schemas.openxmlformats.org/officeDocument/2006/customXml" ds:itemID="{55072894-CA39-412D-9A61-38D9C2A09179}">
   <ds:schemaRefs>
     <ds:schemaRef ds:uri="http://schemas.openxmlformats.org/officeDocument/2006/bibliography"/>
   </ds:schemaRefs>

</xml_diff>

<commit_message>
added split since training data
</commit_message>
<xml_diff>
--- a/Data Preparation/poc_train_test_strategy_updated.docx
+++ b/Data Preparation/poc_train_test_strategy_updated.docx
@@ -1632,8 +1632,26 @@
                 <w:sz w:val="20"/>
                 <w:szCs w:val="20"/>
               </w:rPr>
-              <w:t>Months of Dat</w:t>
-            </w:r>
+              <w:t>Months of Data Available</w:t>
+            </w:r>
+          </w:p>
+        </w:tc>
+        <w:tc>
+          <w:tcPr>
+            <w:tcW w:w="5779" w:type="dxa"/>
+            <w:shd w:val="clear" w:color="auto" w:fill="1F3864"/>
+            <w:tcMar>
+              <w:top w:w="100" w:type="dxa"/>
+              <w:left w:w="150" w:type="dxa"/>
+              <w:bottom w:w="100" w:type="dxa"/>
+              <w:right w:w="150" w:type="dxa"/>
+            </w:tcMar>
+            <w:vAlign w:val="center"/>
+          </w:tcPr>
+          <w:p>
+            <w:pPr>
+              <w:jc w:val="center"/>
+            </w:pPr>
             <w:r>
               <w:rPr>
                 <w:b/>
@@ -1642,13 +1660,13 @@
                 <w:sz w:val="20"/>
                 <w:szCs w:val="20"/>
               </w:rPr>
-              <w:t>a Available</w:t>
-            </w:r>
-          </w:p>
-        </w:tc>
-        <w:tc>
-          <w:tcPr>
-            <w:tcW w:w="5779" w:type="dxa"/>
+              <w:t>Unique Dealer-Model Combos</w:t>
+            </w:r>
+          </w:p>
+        </w:tc>
+        <w:tc>
+          <w:tcPr>
+            <w:tcW w:w="1590" w:type="dxa"/>
             <w:shd w:val="clear" w:color="auto" w:fill="1F3864"/>
             <w:tcMar>
               <w:top w:w="100" w:type="dxa"/>
@@ -1670,18 +1688,45 @@
                 <w:sz w:val="20"/>
                 <w:szCs w:val="20"/>
               </w:rPr>
-              <w:t>Unique Dealer-Model Combos</w:t>
-            </w:r>
-          </w:p>
-        </w:tc>
-        <w:tc>
-          <w:tcPr>
-            <w:tcW w:w="1590" w:type="dxa"/>
-            <w:shd w:val="clear" w:color="auto" w:fill="1F3864"/>
-            <w:tcMar>
-              <w:top w:w="100" w:type="dxa"/>
-              <w:left w:w="150" w:type="dxa"/>
-              <w:bottom w:w="100" w:type="dxa"/>
+              <w:t>Included in Training</w:t>
+            </w:r>
+          </w:p>
+        </w:tc>
+      </w:tr>
+      <w:tr>
+        <w:tc>
+          <w:tcPr>
+            <w:tcW w:w="2711" w:type="dxa"/>
+            <w:shd w:val="clear" w:color="auto" w:fill="D9EAD3"/>
+            <w:tcMar>
+              <w:top w:w="80" w:type="dxa"/>
+              <w:left w:w="150" w:type="dxa"/>
+              <w:bottom w:w="80" w:type="dxa"/>
+              <w:right w:w="150" w:type="dxa"/>
+            </w:tcMar>
+            <w:vAlign w:val="center"/>
+          </w:tcPr>
+          <w:p>
+            <w:r>
+              <w:rPr>
+                <w:b/>
+                <w:bCs/>
+                <w:color w:val="1E5C1E"/>
+                <w:sz w:val="20"/>
+                <w:szCs w:val="20"/>
+              </w:rPr>
+              <w:t>≥24 months</w:t>
+            </w:r>
+          </w:p>
+        </w:tc>
+        <w:tc>
+          <w:tcPr>
+            <w:tcW w:w="5779" w:type="dxa"/>
+            <w:shd w:val="clear" w:color="auto" w:fill="D9EAD3"/>
+            <w:tcMar>
+              <w:top w:w="80" w:type="dxa"/>
+              <w:left w:w="150" w:type="dxa"/>
+              <w:bottom w:w="80" w:type="dxa"/>
               <w:right w:w="150" w:type="dxa"/>
             </w:tcMar>
             <w:vAlign w:val="center"/>
@@ -1694,19 +1739,17 @@
               <w:rPr>
                 <w:b/>
                 <w:bCs/>
-                <w:color w:val="FFFFFF"/>
-                <w:sz w:val="20"/>
-                <w:szCs w:val="20"/>
-              </w:rPr>
-              <w:t>Included in Training</w:t>
-            </w:r>
-          </w:p>
-        </w:tc>
-      </w:tr>
-      <w:tr>
-        <w:tc>
-          <w:tcPr>
-            <w:tcW w:w="2711" w:type="dxa"/>
+                <w:color w:val="1E5C1E"/>
+                <w:sz w:val="20"/>
+                <w:szCs w:val="20"/>
+              </w:rPr>
+              <w:t>74,383</w:t>
+            </w:r>
+          </w:p>
+        </w:tc>
+        <w:tc>
+          <w:tcPr>
+            <w:tcW w:w="1590" w:type="dxa"/>
             <w:shd w:val="clear" w:color="auto" w:fill="D9EAD3"/>
             <w:tcMar>
               <w:top w:w="80" w:type="dxa"/>
@@ -1717,6 +1760,9 @@
             <w:vAlign w:val="center"/>
           </w:tcPr>
           <w:p>
+            <w:pPr>
+              <w:jc w:val="center"/>
+            </w:pPr>
             <w:r>
               <w:rPr>
                 <w:b/>
@@ -1725,14 +1771,39 @@
                 <w:sz w:val="20"/>
                 <w:szCs w:val="20"/>
               </w:rPr>
-              <w:t>≥24 months</w:t>
+              <w:t>✓ Yes</w:t>
+            </w:r>
+          </w:p>
+        </w:tc>
+      </w:tr>
+      <w:tr>
+        <w:tc>
+          <w:tcPr>
+            <w:tcW w:w="2711" w:type="dxa"/>
+            <w:shd w:val="clear" w:color="auto" w:fill="F2F2F2"/>
+            <w:tcMar>
+              <w:top w:w="80" w:type="dxa"/>
+              <w:left w:w="150" w:type="dxa"/>
+              <w:bottom w:w="80" w:type="dxa"/>
+              <w:right w:w="150" w:type="dxa"/>
+            </w:tcMar>
+            <w:vAlign w:val="center"/>
+          </w:tcPr>
+          <w:p>
+            <w:r>
+              <w:rPr>
+                <w:color w:val="888888"/>
+                <w:sz w:val="20"/>
+                <w:szCs w:val="20"/>
+              </w:rPr>
+              <w:t>18 to 23 months</w:t>
             </w:r>
           </w:p>
         </w:tc>
         <w:tc>
           <w:tcPr>
             <w:tcW w:w="5779" w:type="dxa"/>
-            <w:shd w:val="clear" w:color="auto" w:fill="D9EAD3"/>
+            <w:shd w:val="clear" w:color="auto" w:fill="F2F2F2"/>
             <w:tcMar>
               <w:top w:w="80" w:type="dxa"/>
               <w:left w:w="150" w:type="dxa"/>
@@ -1747,20 +1818,18 @@
             </w:pPr>
             <w:r>
               <w:rPr>
-                <w:b/>
-                <w:bCs/>
-                <w:color w:val="1E5C1E"/>
-                <w:sz w:val="20"/>
-                <w:szCs w:val="20"/>
-              </w:rPr>
-              <w:t>74,383</w:t>
+                <w:color w:val="888888"/>
+                <w:sz w:val="20"/>
+                <w:szCs w:val="20"/>
+              </w:rPr>
+              <w:t>9,505</w:t>
             </w:r>
           </w:p>
         </w:tc>
         <w:tc>
           <w:tcPr>
             <w:tcW w:w="1590" w:type="dxa"/>
-            <w:shd w:val="clear" w:color="auto" w:fill="D9EAD3"/>
+            <w:shd w:val="clear" w:color="auto" w:fill="F2F2F2"/>
             <w:tcMar>
               <w:top w:w="80" w:type="dxa"/>
               <w:left w:w="150" w:type="dxa"/>
@@ -1775,23 +1844,11 @@
             </w:pPr>
             <w:r>
               <w:rPr>
-                <w:b/>
-                <w:bCs/>
-                <w:color w:val="1E5C1E"/>
-                <w:sz w:val="20"/>
-                <w:szCs w:val="20"/>
-              </w:rPr>
-              <w:t>✓</w:t>
-            </w:r>
-            <w:r>
-              <w:rPr>
-                <w:b/>
-                <w:bCs/>
-                <w:color w:val="1E5C1E"/>
-                <w:sz w:val="20"/>
-                <w:szCs w:val="20"/>
-              </w:rPr>
-              <w:t xml:space="preserve"> Yes</w:t>
+                <w:color w:val="888888"/>
+                <w:sz w:val="20"/>
+                <w:szCs w:val="20"/>
+              </w:rPr>
+              <w:t>✗ Excluded</w:t>
             </w:r>
           </w:p>
         </w:tc>
@@ -1800,7 +1857,7 @@
         <w:tc>
           <w:tcPr>
             <w:tcW w:w="2711" w:type="dxa"/>
-            <w:shd w:val="clear" w:color="auto" w:fill="F2F2F2"/>
+            <w:shd w:val="clear" w:color="auto" w:fill="FFFFFF"/>
             <w:tcMar>
               <w:top w:w="80" w:type="dxa"/>
               <w:left w:w="150" w:type="dxa"/>
@@ -1816,14 +1873,14 @@
                 <w:sz w:val="20"/>
                 <w:szCs w:val="20"/>
               </w:rPr>
-              <w:t>18 to 23 months</w:t>
+              <w:t>12 to 17 months</w:t>
             </w:r>
           </w:p>
         </w:tc>
         <w:tc>
           <w:tcPr>
             <w:tcW w:w="5779" w:type="dxa"/>
-            <w:shd w:val="clear" w:color="auto" w:fill="F2F2F2"/>
+            <w:shd w:val="clear" w:color="auto" w:fill="FFFFFF"/>
             <w:tcMar>
               <w:top w:w="80" w:type="dxa"/>
               <w:left w:w="150" w:type="dxa"/>
@@ -1842,14 +1899,14 @@
                 <w:sz w:val="20"/>
                 <w:szCs w:val="20"/>
               </w:rPr>
-              <w:t>9,505</w:t>
+              <w:t>9,261</w:t>
             </w:r>
           </w:p>
         </w:tc>
         <w:tc>
           <w:tcPr>
             <w:tcW w:w="1590" w:type="dxa"/>
-            <w:shd w:val="clear" w:color="auto" w:fill="F2F2F2"/>
+            <w:shd w:val="clear" w:color="auto" w:fill="FFFFFF"/>
             <w:tcMar>
               <w:top w:w="80" w:type="dxa"/>
               <w:left w:w="150" w:type="dxa"/>
@@ -1868,15 +1925,7 @@
                 <w:sz w:val="20"/>
                 <w:szCs w:val="20"/>
               </w:rPr>
-              <w:t>✗</w:t>
-            </w:r>
-            <w:r>
-              <w:rPr>
-                <w:color w:val="888888"/>
-                <w:sz w:val="20"/>
-                <w:szCs w:val="20"/>
-              </w:rPr>
-              <w:t xml:space="preserve"> Excluded</w:t>
+              <w:t>✗ Excluded</w:t>
             </w:r>
           </w:p>
         </w:tc>
@@ -1885,7 +1934,7 @@
         <w:tc>
           <w:tcPr>
             <w:tcW w:w="2711" w:type="dxa"/>
-            <w:shd w:val="clear" w:color="auto" w:fill="FFFFFF"/>
+            <w:shd w:val="clear" w:color="auto" w:fill="F2F2F2"/>
             <w:tcMar>
               <w:top w:w="80" w:type="dxa"/>
               <w:left w:w="150" w:type="dxa"/>
@@ -1901,14 +1950,14 @@
                 <w:sz w:val="20"/>
                 <w:szCs w:val="20"/>
               </w:rPr>
-              <w:t>12 to 17 months</w:t>
+              <w:t>&lt;12 months</w:t>
             </w:r>
           </w:p>
         </w:tc>
         <w:tc>
           <w:tcPr>
             <w:tcW w:w="5779" w:type="dxa"/>
-            <w:shd w:val="clear" w:color="auto" w:fill="FFFFFF"/>
+            <w:shd w:val="clear" w:color="auto" w:fill="F2F2F2"/>
             <w:tcMar>
               <w:top w:w="80" w:type="dxa"/>
               <w:left w:w="150" w:type="dxa"/>
@@ -1927,14 +1976,14 @@
                 <w:sz w:val="20"/>
                 <w:szCs w:val="20"/>
               </w:rPr>
-              <w:t>9,261</w:t>
+              <w:t>15,699</w:t>
             </w:r>
           </w:p>
         </w:tc>
         <w:tc>
           <w:tcPr>
             <w:tcW w:w="1590" w:type="dxa"/>
-            <w:shd w:val="clear" w:color="auto" w:fill="FFFFFF"/>
+            <w:shd w:val="clear" w:color="auto" w:fill="F2F2F2"/>
             <w:tcMar>
               <w:top w:w="80" w:type="dxa"/>
               <w:left w:w="150" w:type="dxa"/>
@@ -1953,15 +2002,7 @@
                 <w:sz w:val="20"/>
                 <w:szCs w:val="20"/>
               </w:rPr>
-              <w:t>✗</w:t>
-            </w:r>
-            <w:r>
-              <w:rPr>
-                <w:color w:val="888888"/>
-                <w:sz w:val="20"/>
-                <w:szCs w:val="20"/>
-              </w:rPr>
-              <w:t xml:space="preserve"> Excluded</w:t>
+              <w:t>✗ Excluded</w:t>
             </w:r>
           </w:p>
         </w:tc>
@@ -1970,34 +2011,36 @@
         <w:tc>
           <w:tcPr>
             <w:tcW w:w="2711" w:type="dxa"/>
-            <w:shd w:val="clear" w:color="auto" w:fill="F2F2F2"/>
-            <w:tcMar>
-              <w:top w:w="80" w:type="dxa"/>
-              <w:left w:w="150" w:type="dxa"/>
-              <w:bottom w:w="80" w:type="dxa"/>
-              <w:right w:w="150" w:type="dxa"/>
-            </w:tcMar>
-            <w:vAlign w:val="center"/>
-          </w:tcPr>
-          <w:p>
-            <w:r>
-              <w:rPr>
-                <w:color w:val="888888"/>
-                <w:sz w:val="20"/>
-                <w:szCs w:val="20"/>
-              </w:rPr>
-              <w:t>&lt;12 months</w:t>
+            <w:shd w:val="clear" w:color="auto" w:fill="1F3864"/>
+            <w:tcMar>
+              <w:top w:w="100" w:type="dxa"/>
+              <w:left w:w="150" w:type="dxa"/>
+              <w:bottom w:w="100" w:type="dxa"/>
+              <w:right w:w="150" w:type="dxa"/>
+            </w:tcMar>
+            <w:vAlign w:val="center"/>
+          </w:tcPr>
+          <w:p>
+            <w:r>
+              <w:rPr>
+                <w:b/>
+                <w:bCs/>
+                <w:color w:val="FFFFFF"/>
+                <w:sz w:val="20"/>
+                <w:szCs w:val="20"/>
+              </w:rPr>
+              <w:t>Total</w:t>
             </w:r>
           </w:p>
         </w:tc>
         <w:tc>
           <w:tcPr>
             <w:tcW w:w="5779" w:type="dxa"/>
-            <w:shd w:val="clear" w:color="auto" w:fill="F2F2F2"/>
-            <w:tcMar>
-              <w:top w:w="80" w:type="dxa"/>
-              <w:left w:w="150" w:type="dxa"/>
-              <w:bottom w:w="80" w:type="dxa"/>
+            <w:shd w:val="clear" w:color="auto" w:fill="1F3864"/>
+            <w:tcMar>
+              <w:top w:w="100" w:type="dxa"/>
+              <w:left w:w="150" w:type="dxa"/>
+              <w:bottom w:w="100" w:type="dxa"/>
               <w:right w:w="150" w:type="dxa"/>
             </w:tcMar>
             <w:vAlign w:val="center"/>
@@ -2008,22 +2051,24 @@
             </w:pPr>
             <w:r>
               <w:rPr>
-                <w:color w:val="888888"/>
-                <w:sz w:val="20"/>
-                <w:szCs w:val="20"/>
-              </w:rPr>
-              <w:t>15,699</w:t>
+                <w:b/>
+                <w:bCs/>
+                <w:color w:val="FFFFFF"/>
+                <w:sz w:val="20"/>
+                <w:szCs w:val="20"/>
+              </w:rPr>
+              <w:t>108,848</w:t>
             </w:r>
           </w:p>
         </w:tc>
         <w:tc>
           <w:tcPr>
             <w:tcW w:w="1590" w:type="dxa"/>
-            <w:shd w:val="clear" w:color="auto" w:fill="F2F2F2"/>
-            <w:tcMar>
-              <w:top w:w="80" w:type="dxa"/>
-              <w:left w:w="150" w:type="dxa"/>
-              <w:bottom w:w="80" w:type="dxa"/>
+            <w:shd w:val="clear" w:color="auto" w:fill="1F3864"/>
+            <w:tcMar>
+              <w:top w:w="100" w:type="dxa"/>
+              <w:left w:w="150" w:type="dxa"/>
+              <w:bottom w:w="100" w:type="dxa"/>
               <w:right w:w="150" w:type="dxa"/>
             </w:tcMar>
             <w:vAlign w:val="center"/>
@@ -2034,102 +2079,379 @@
             </w:pPr>
             <w:r>
               <w:rPr>
-                <w:color w:val="888888"/>
-                <w:sz w:val="20"/>
-                <w:szCs w:val="20"/>
-              </w:rPr>
-              <w:t>✗</w:t>
-            </w:r>
-            <w:r>
-              <w:rPr>
-                <w:color w:val="888888"/>
-                <w:sz w:val="20"/>
-                <w:szCs w:val="20"/>
-              </w:rPr>
-              <w:t xml:space="preserve"> Excluded</w:t>
-            </w:r>
-          </w:p>
-        </w:tc>
-      </w:tr>
-      <w:tr>
-        <w:tc>
-          <w:tcPr>
-            <w:tcW w:w="2711" w:type="dxa"/>
-            <w:shd w:val="clear" w:color="auto" w:fill="1F3864"/>
-            <w:tcMar>
-              <w:top w:w="100" w:type="dxa"/>
-              <w:left w:w="150" w:type="dxa"/>
-              <w:bottom w:w="100" w:type="dxa"/>
-              <w:right w:w="150" w:type="dxa"/>
-            </w:tcMar>
-            <w:vAlign w:val="center"/>
-          </w:tcPr>
-          <w:p>
-            <w:r>
-              <w:rPr>
                 <w:b/>
                 <w:bCs/>
                 <w:color w:val="FFFFFF"/>
                 <w:sz w:val="20"/>
                 <w:szCs w:val="20"/>
               </w:rPr>
-              <w:t>Total</w:t>
-            </w:r>
-          </w:p>
-        </w:tc>
-        <w:tc>
-          <w:tcPr>
-            <w:tcW w:w="5779" w:type="dxa"/>
-            <w:shd w:val="clear" w:color="auto" w:fill="1F3864"/>
-            <w:tcMar>
-              <w:top w:w="100" w:type="dxa"/>
-              <w:left w:w="150" w:type="dxa"/>
-              <w:bottom w:w="100" w:type="dxa"/>
-              <w:right w:w="150" w:type="dxa"/>
-            </w:tcMar>
-            <w:vAlign w:val="center"/>
+              <w:t>74,383 (68.3%)</w:t>
+            </w:r>
+          </w:p>
+        </w:tc>
+      </w:tr>
+    </w:tbl>
+    <w:p>
+      <w:pPr>
+        <w:spacing w:after="240"/>
+      </w:pPr>
+    </w:p>
+    <w:p>
+      <w:r>
+        <w:br w:type="page"/>
+      </w:r>
+    </w:p>
+    <w:p>
+      <w:pPr>
+        <w:spacing w:after="240"/>
+      </w:pPr>
+      <w:r>
+        <w:lastRenderedPageBreak/>
+        <w:t>Table above shows the split of count of all the unique parent dealer combos but since my training data will be from Jan’22 to Sep’25, the count of unique parent dealer model family combinations will be different, it will be what is given in the table below</w:t>
+      </w:r>
+    </w:p>
+    <w:tbl>
+      <w:tblPr>
+        <w:tblW w:w="8140" w:type="dxa"/>
+        <w:tblLook w:val="04A0" w:firstRow="1" w:lastRow="0" w:firstColumn="1" w:lastColumn="0" w:noHBand="0" w:noVBand="1"/>
+      </w:tblPr>
+      <w:tblGrid>
+        <w:gridCol w:w="2540"/>
+        <w:gridCol w:w="5779"/>
+      </w:tblGrid>
+      <w:tr>
+        <w:trPr>
+          <w:trHeight w:val="300"/>
+        </w:trPr>
+        <w:tc>
+          <w:tcPr>
+            <w:tcW w:w="2420" w:type="dxa"/>
+            <w:tcBorders>
+              <w:top w:val="single" w:sz="8" w:space="0" w:color="auto"/>
+              <w:left w:val="single" w:sz="8" w:space="0" w:color="auto"/>
+              <w:bottom w:val="single" w:sz="8" w:space="0" w:color="auto"/>
+              <w:right w:val="single" w:sz="8" w:space="0" w:color="auto"/>
+            </w:tcBorders>
+            <w:shd w:val="clear" w:color="000000" w:fill="5B9BD5"/>
+            <w:noWrap/>
+            <w:vAlign w:val="center"/>
+            <w:hideMark/>
           </w:tcPr>
           <w:p>
             <w:pPr>
-              <w:jc w:val="center"/>
-            </w:pPr>
-            <w:r>
-              <w:rPr>
+              <w:rPr>
+                <w:rFonts w:ascii="Calibri" w:eastAsia="Times New Roman" w:hAnsi="Calibri" w:cs="Calibri"/>
                 <w:b/>
                 <w:bCs/>
                 <w:color w:val="FFFFFF"/>
-                <w:sz w:val="20"/>
-                <w:szCs w:val="20"/>
-              </w:rPr>
-              <w:t>108,848</w:t>
-            </w:r>
-          </w:p>
-        </w:tc>
-        <w:tc>
-          <w:tcPr>
-            <w:tcW w:w="1590" w:type="dxa"/>
-            <w:shd w:val="clear" w:color="auto" w:fill="1F3864"/>
-            <w:tcMar>
-              <w:top w:w="100" w:type="dxa"/>
-              <w:left w:w="150" w:type="dxa"/>
-              <w:bottom w:w="100" w:type="dxa"/>
-              <w:right w:w="150" w:type="dxa"/>
-            </w:tcMar>
-            <w:vAlign w:val="center"/>
-          </w:tcPr>
-          <w:p>
-            <w:pPr>
-              <w:jc w:val="center"/>
+              </w:rPr>
             </w:pPr>
             <w:r>
               <w:rPr>
+                <w:rFonts w:ascii="Calibri" w:eastAsia="Times New Roman" w:hAnsi="Calibri" w:cs="Calibri"/>
                 <w:b/>
                 <w:bCs/>
                 <w:color w:val="FFFFFF"/>
-                <w:sz w:val="20"/>
-                <w:szCs w:val="20"/>
-              </w:rPr>
-              <w:t>74,383 (68.3%)</w:t>
+              </w:rPr>
+              <w:t>GROUPING_OF_MONTHS</w:t>
+            </w:r>
+          </w:p>
+        </w:tc>
+        <w:tc>
+          <w:tcPr>
+            <w:tcW w:w="5720" w:type="dxa"/>
+            <w:tcBorders>
+              <w:top w:val="single" w:sz="8" w:space="0" w:color="auto"/>
+              <w:left w:val="nil"/>
+              <w:bottom w:val="single" w:sz="8" w:space="0" w:color="auto"/>
+              <w:right w:val="single" w:sz="8" w:space="0" w:color="auto"/>
+            </w:tcBorders>
+            <w:shd w:val="clear" w:color="000000" w:fill="5B9BD5"/>
+            <w:noWrap/>
+            <w:vAlign w:val="center"/>
+            <w:hideMark/>
+          </w:tcPr>
+          <w:p>
+            <w:pPr>
+              <w:rPr>
+                <w:rFonts w:ascii="Calibri" w:eastAsia="Times New Roman" w:hAnsi="Calibri" w:cs="Calibri"/>
+                <w:b/>
+                <w:bCs/>
+                <w:color w:val="FFFFFF"/>
+              </w:rPr>
+            </w:pPr>
+            <w:r>
+              <w:rPr>
+                <w:rFonts w:ascii="Calibri" w:eastAsia="Times New Roman" w:hAnsi="Calibri" w:cs="Calibri"/>
+                <w:b/>
+                <w:bCs/>
+                <w:color w:val="FFFFFF"/>
+              </w:rPr>
+              <w:t>UNIQUE_PARENT_DEALER_CODE_MODEL_FAMILY_COMBOS</w:t>
+            </w:r>
+          </w:p>
+        </w:tc>
+      </w:tr>
+      <w:tr>
+        <w:trPr>
+          <w:trHeight w:val="300"/>
+        </w:trPr>
+        <w:tc>
+          <w:tcPr>
+            <w:tcW w:w="2420" w:type="dxa"/>
+            <w:tcBorders>
+              <w:top w:val="nil"/>
+              <w:left w:val="single" w:sz="8" w:space="0" w:color="auto"/>
+              <w:bottom w:val="single" w:sz="8" w:space="0" w:color="auto"/>
+              <w:right w:val="single" w:sz="8" w:space="0" w:color="auto"/>
+            </w:tcBorders>
+            <w:shd w:val="clear" w:color="auto" w:fill="auto"/>
+            <w:noWrap/>
+            <w:vAlign w:val="center"/>
+            <w:hideMark/>
+          </w:tcPr>
+          <w:p>
+            <w:pPr>
+              <w:rPr>
+                <w:rFonts w:ascii="Calibri" w:eastAsia="Times New Roman" w:hAnsi="Calibri" w:cs="Calibri"/>
+                <w:color w:val="000000"/>
+              </w:rPr>
+            </w:pPr>
+            <w:r>
+              <w:rPr>
+                <w:rFonts w:ascii="Calibri" w:eastAsia="Times New Roman" w:hAnsi="Calibri" w:cs="Calibri"/>
+                <w:color w:val="000000"/>
+              </w:rPr>
+              <w:t>12 to 17</w:t>
+            </w:r>
+          </w:p>
+        </w:tc>
+        <w:tc>
+          <w:tcPr>
+            <w:tcW w:w="5720" w:type="dxa"/>
+            <w:tcBorders>
+              <w:top w:val="nil"/>
+              <w:left w:val="nil"/>
+              <w:bottom w:val="single" w:sz="8" w:space="0" w:color="auto"/>
+              <w:right w:val="single" w:sz="8" w:space="0" w:color="auto"/>
+            </w:tcBorders>
+            <w:shd w:val="clear" w:color="auto" w:fill="auto"/>
+            <w:noWrap/>
+            <w:vAlign w:val="center"/>
+            <w:hideMark/>
+          </w:tcPr>
+          <w:p>
+            <w:pPr>
+              <w:jc w:val="right"/>
+              <w:rPr>
+                <w:rFonts w:ascii="Calibri" w:eastAsia="Times New Roman" w:hAnsi="Calibri" w:cs="Calibri"/>
+                <w:color w:val="000000"/>
+              </w:rPr>
+            </w:pPr>
+            <w:r>
+              <w:rPr>
+                <w:rFonts w:ascii="Calibri" w:eastAsia="Times New Roman" w:hAnsi="Calibri" w:cs="Calibri"/>
+                <w:color w:val="000000"/>
+              </w:rPr>
+              <w:t>10171</w:t>
+            </w:r>
+          </w:p>
+        </w:tc>
+      </w:tr>
+      <w:tr>
+        <w:trPr>
+          <w:trHeight w:val="300"/>
+        </w:trPr>
+        <w:tc>
+          <w:tcPr>
+            <w:tcW w:w="2420" w:type="dxa"/>
+            <w:tcBorders>
+              <w:top w:val="nil"/>
+              <w:left w:val="single" w:sz="8" w:space="0" w:color="auto"/>
+              <w:bottom w:val="single" w:sz="8" w:space="0" w:color="auto"/>
+              <w:right w:val="single" w:sz="8" w:space="0" w:color="auto"/>
+            </w:tcBorders>
+            <w:shd w:val="clear" w:color="auto" w:fill="auto"/>
+            <w:noWrap/>
+            <w:vAlign w:val="center"/>
+            <w:hideMark/>
+          </w:tcPr>
+          <w:p>
+            <w:pPr>
+              <w:rPr>
+                <w:rFonts w:ascii="Calibri" w:eastAsia="Times New Roman" w:hAnsi="Calibri" w:cs="Calibri"/>
+                <w:color w:val="000000"/>
+              </w:rPr>
+            </w:pPr>
+            <w:r>
+              <w:rPr>
+                <w:rFonts w:ascii="Calibri" w:eastAsia="Times New Roman" w:hAnsi="Calibri" w:cs="Calibri"/>
+                <w:color w:val="000000"/>
+              </w:rPr>
+              <w:t>18 to 23</w:t>
+            </w:r>
+          </w:p>
+        </w:tc>
+        <w:tc>
+          <w:tcPr>
+            <w:tcW w:w="5720" w:type="dxa"/>
+            <w:tcBorders>
+              <w:top w:val="nil"/>
+              <w:left w:val="nil"/>
+              <w:bottom w:val="single" w:sz="8" w:space="0" w:color="auto"/>
+              <w:right w:val="single" w:sz="8" w:space="0" w:color="auto"/>
+            </w:tcBorders>
+            <w:shd w:val="clear" w:color="auto" w:fill="auto"/>
+            <w:noWrap/>
+            <w:vAlign w:val="center"/>
+            <w:hideMark/>
+          </w:tcPr>
+          <w:p>
+            <w:pPr>
+              <w:jc w:val="right"/>
+              <w:rPr>
+                <w:rFonts w:ascii="Calibri" w:eastAsia="Times New Roman" w:hAnsi="Calibri" w:cs="Calibri"/>
+                <w:color w:val="000000"/>
+              </w:rPr>
+            </w:pPr>
+            <w:r>
+              <w:rPr>
+                <w:rFonts w:ascii="Calibri" w:eastAsia="Times New Roman" w:hAnsi="Calibri" w:cs="Calibri"/>
+                <w:color w:val="000000"/>
+              </w:rPr>
+              <w:t>8961</w:t>
+            </w:r>
+          </w:p>
+        </w:tc>
+      </w:tr>
+      <w:tr>
+        <w:trPr>
+          <w:trHeight w:val="300"/>
+        </w:trPr>
+        <w:tc>
+          <w:tcPr>
+            <w:tcW w:w="2420" w:type="dxa"/>
+            <w:tcBorders>
+              <w:top w:val="nil"/>
+              <w:left w:val="single" w:sz="8" w:space="0" w:color="auto"/>
+              <w:bottom w:val="single" w:sz="8" w:space="0" w:color="auto"/>
+              <w:right w:val="single" w:sz="8" w:space="0" w:color="auto"/>
+            </w:tcBorders>
+            <w:shd w:val="clear" w:color="auto" w:fill="auto"/>
+            <w:noWrap/>
+            <w:vAlign w:val="center"/>
+            <w:hideMark/>
+          </w:tcPr>
+          <w:p>
+            <w:pPr>
+              <w:rPr>
+                <w:rFonts w:ascii="Calibri" w:eastAsia="Times New Roman" w:hAnsi="Calibri" w:cs="Calibri"/>
+                <w:color w:val="000000"/>
+              </w:rPr>
+            </w:pPr>
+            <w:r>
+              <w:rPr>
+                <w:rFonts w:ascii="Calibri" w:eastAsia="Times New Roman" w:hAnsi="Calibri" w:cs="Calibri"/>
+                <w:color w:val="000000"/>
+              </w:rPr>
+              <w:t>&lt;12</w:t>
+            </w:r>
+          </w:p>
+        </w:tc>
+        <w:tc>
+          <w:tcPr>
+            <w:tcW w:w="5720" w:type="dxa"/>
+            <w:tcBorders>
+              <w:top w:val="nil"/>
+              <w:left w:val="nil"/>
+              <w:bottom w:val="single" w:sz="8" w:space="0" w:color="auto"/>
+              <w:right w:val="single" w:sz="8" w:space="0" w:color="auto"/>
+            </w:tcBorders>
+            <w:shd w:val="clear" w:color="auto" w:fill="auto"/>
+            <w:noWrap/>
+            <w:vAlign w:val="center"/>
+            <w:hideMark/>
+          </w:tcPr>
+          <w:p>
+            <w:pPr>
+              <w:jc w:val="right"/>
+              <w:rPr>
+                <w:rFonts w:ascii="Calibri" w:eastAsia="Times New Roman" w:hAnsi="Calibri" w:cs="Calibri"/>
+                <w:color w:val="000000"/>
+              </w:rPr>
+            </w:pPr>
+            <w:r>
+              <w:rPr>
+                <w:rFonts w:ascii="Calibri" w:eastAsia="Times New Roman" w:hAnsi="Calibri" w:cs="Calibri"/>
+                <w:color w:val="000000"/>
+              </w:rPr>
+              <w:t>12715</w:t>
+            </w:r>
+          </w:p>
+        </w:tc>
+      </w:tr>
+      <w:tr>
+        <w:trPr>
+          <w:trHeight w:val="300"/>
+        </w:trPr>
+        <w:tc>
+          <w:tcPr>
+            <w:tcW w:w="2420" w:type="dxa"/>
+            <w:tcBorders>
+              <w:top w:val="nil"/>
+              <w:left w:val="single" w:sz="8" w:space="0" w:color="auto"/>
+              <w:bottom w:val="single" w:sz="8" w:space="0" w:color="auto"/>
+              <w:right w:val="single" w:sz="8" w:space="0" w:color="auto"/>
+            </w:tcBorders>
+            <w:shd w:val="clear" w:color="auto" w:fill="auto"/>
+            <w:noWrap/>
+            <w:vAlign w:val="center"/>
+            <w:hideMark/>
+          </w:tcPr>
+          <w:p>
+            <w:pPr>
+              <w:rPr>
+                <w:rFonts w:ascii="Calibri" w:eastAsia="Times New Roman" w:hAnsi="Calibri" w:cs="Calibri"/>
+                <w:color w:val="000000"/>
+              </w:rPr>
+            </w:pPr>
+            <w:r>
+              <w:rPr>
+                <w:rFonts w:ascii="Calibri" w:eastAsia="Times New Roman" w:hAnsi="Calibri" w:cs="Calibri"/>
+                <w:color w:val="000000"/>
+              </w:rPr>
+              <w:t>&gt;=24</w:t>
+            </w:r>
+          </w:p>
+        </w:tc>
+        <w:tc>
+          <w:tcPr>
+            <w:tcW w:w="5720" w:type="dxa"/>
+            <w:tcBorders>
+              <w:top w:val="nil"/>
+              <w:left w:val="nil"/>
+              <w:bottom w:val="single" w:sz="8" w:space="0" w:color="auto"/>
+              <w:right w:val="single" w:sz="8" w:space="0" w:color="auto"/>
+            </w:tcBorders>
+            <w:shd w:val="clear" w:color="auto" w:fill="auto"/>
+            <w:noWrap/>
+            <w:vAlign w:val="center"/>
+            <w:hideMark/>
+          </w:tcPr>
+          <w:p>
+            <w:pPr>
+              <w:jc w:val="right"/>
+              <w:rPr>
+                <w:rFonts w:ascii="Calibri" w:eastAsia="Times New Roman" w:hAnsi="Calibri" w:cs="Calibri"/>
+                <w:color w:val="000000"/>
+              </w:rPr>
+            </w:pPr>
+            <w:r>
+              <w:rPr>
+                <w:rFonts w:ascii="Calibri" w:eastAsia="Times New Roman" w:hAnsi="Calibri" w:cs="Calibri"/>
+                <w:color w:val="000000"/>
+              </w:rPr>
+              <w:t>69908</w:t>
             </w:r>
           </w:p>
         </w:tc>
@@ -2141,6 +2463,36 @@
       </w:pPr>
       <w:bookmarkStart w:id="0" w:name="_GoBack"/>
       <w:bookmarkEnd w:id="0"/>
+    </w:p>
+    <w:p>
+      <w:pPr>
+        <w:spacing w:after="240"/>
+      </w:pPr>
+    </w:p>
+    <w:p>
+      <w:pPr>
+        <w:spacing w:after="240"/>
+      </w:pPr>
+    </w:p>
+    <w:p>
+      <w:pPr>
+        <w:spacing w:after="240"/>
+      </w:pPr>
+    </w:p>
+    <w:p>
+      <w:pPr>
+        <w:spacing w:after="240"/>
+      </w:pPr>
+    </w:p>
+    <w:p>
+      <w:pPr>
+        <w:spacing w:after="240"/>
+      </w:pPr>
+    </w:p>
+    <w:p>
+      <w:pPr>
+        <w:spacing w:after="240"/>
+      </w:pPr>
     </w:p>
     <w:p>
       <w:pPr>
@@ -2169,7 +2521,6 @@
           <w:sz w:val="20"/>
           <w:szCs w:val="20"/>
         </w:rPr>
-        <w:lastRenderedPageBreak/>
         <w:t>Note: TFT has access to static dealer and product attributes that Snowflake ML Forecast does not natively support. Any performance improvement from TFT therefore reflects both the architectural advantage of TFT and the additional covariate information it can consume.</w:t>
       </w:r>
       <w:r>
@@ -3291,7 +3642,7 @@
 </file>
 
 <file path=customXml/itemProps1.xml><?xml version="1.0" encoding="utf-8"?>
-<ds:datastoreItem xmlns:ds="http://schemas.openxmlformats.org/officeDocument/2006/customXml" ds:itemID="{55072894-CA39-412D-9A61-38D9C2A09179}">
+<ds:datastoreItem xmlns:ds="http://schemas.openxmlformats.org/officeDocument/2006/customXml" ds:itemID="{169C70F4-83BB-4C52-9F4B-925C893D19E1}">
   <ds:schemaRefs>
     <ds:schemaRef ds:uri="http://schemas.openxmlformats.org/officeDocument/2006/bibliography"/>
   </ds:schemaRefs>

</xml_diff>